<commit_message>
Guias para Claude, scripts y mds para agente IA y Import
</commit_message>
<xml_diff>
--- a/docs/guia-uso-invoke-ia.docx
+++ b/docs/guia-uso-invoke-ia.docx
@@ -117,7 +117,7 @@
         <w:spacing w:after="60"/>
       </w:pPr>
       <w:r>
-        <w:t>Los módulos 2 al 5 son los de uso diario; los módulos 6–8 son opcionales según tu clínica.</w:t>
+        <w:t>Los módulos 2 al 5 son los de uso diario; los módulos 6–9 son opcionales según tu clínica.</w:t>
       </w:r>
     </w:p>
     <w:p>
@@ -2629,6 +2629,419 @@
                 <w:sz w:val="19"/>
               </w:rPr>
               <w:t>Las citas canceladas permanecen en el historial del paciente para referencia.</w:t>
+            </w:r>
+          </w:p>
+        </w:tc>
+      </w:tr>
+    </w:tbl>
+    <w:p/>
+    <w:p>
+      <w:pPr>
+        <w:pStyle w:val="Heading2"/>
+        <w:spacing w:before="280" w:after="120"/>
+      </w:pPr>
+      <w:r>
+        <w:rPr>
+          <w:color w:val="1E40AF"/>
+        </w:rPr>
+        <w:t>3.3  Enlazar una Cita con un Presupuesto</w:t>
+      </w:r>
+    </w:p>
+    <w:p>
+      <w:r>
+        <w:t>Al crear o editar una cita es posible asociarla a un presupuesto existente o crear uno nuevo en el mismo flujo, sin salir del formulario de cita.</w:t>
+      </w:r>
+    </w:p>
+    <w:p>
+      <w:pPr>
+        <w:pStyle w:val="ListNumber"/>
+        <w:spacing w:before="80" w:after="40"/>
+      </w:pPr>
+      <w:r>
+        <w:rPr>
+          <w:b/>
+          <w:sz w:val="21"/>
+        </w:rPr>
+        <w:t>Abrir el formulario de cita</w:t>
+      </w:r>
+    </w:p>
+    <w:p>
+      <w:pPr>
+        <w:pStyle w:val="ListBullet2"/>
+        <w:spacing w:before="20" w:after="20"/>
+      </w:pPr>
+      <w:r>
+        <w:rPr>
+          <w:sz w:val="20"/>
+        </w:rPr>
+        <w:t>Desde el Calendario, haz clic en un hueco horario o sobre una cita existente.</w:t>
+      </w:r>
+    </w:p>
+    <w:p>
+      <w:pPr>
+        <w:pStyle w:val="ListBullet2"/>
+        <w:spacing w:before="20" w:after="20"/>
+      </w:pPr>
+      <w:r>
+        <w:rPr>
+          <w:sz w:val="20"/>
+        </w:rPr>
+        <w:t>O usa el botón PROGRAMAR desde el ítem de servicio en una Orden de Venta.</w:t>
+      </w:r>
+    </w:p>
+    <w:p>
+      <w:pPr>
+        <w:pStyle w:val="ListNumber"/>
+        <w:spacing w:before="80" w:after="40"/>
+      </w:pPr>
+      <w:r>
+        <w:rPr>
+          <w:b/>
+          <w:sz w:val="21"/>
+        </w:rPr>
+        <w:t>Ir a la sección 'Presupuesto asociado'</w:t>
+      </w:r>
+    </w:p>
+    <w:p>
+      <w:pPr>
+        <w:pStyle w:val="ListBullet2"/>
+        <w:spacing w:before="20" w:after="20"/>
+      </w:pPr>
+      <w:r>
+        <w:rPr>
+          <w:sz w:val="20"/>
+        </w:rPr>
+        <w:t>Dentro del formulario de cita, busca el campo Presupuesto asociado.</w:t>
+      </w:r>
+    </w:p>
+    <w:p>
+      <w:pPr>
+        <w:pStyle w:val="ListNumber"/>
+        <w:spacing w:before="80" w:after="40"/>
+      </w:pPr>
+      <w:r>
+        <w:rPr>
+          <w:b/>
+          <w:sz w:val="21"/>
+        </w:rPr>
+        <w:t>Seleccionar presupuesto existente</w:t>
+      </w:r>
+    </w:p>
+    <w:p>
+      <w:pPr>
+        <w:pStyle w:val="ListBullet2"/>
+        <w:spacing w:before="20" w:after="20"/>
+      </w:pPr>
+      <w:r>
+        <w:rPr>
+          <w:sz w:val="20"/>
+        </w:rPr>
+        <w:t>Despliega la lista y elige un presupuesto activo del paciente.</w:t>
+      </w:r>
+    </w:p>
+    <w:p>
+      <w:pPr>
+        <w:pStyle w:val="ListBullet2"/>
+        <w:spacing w:before="20" w:after="20"/>
+      </w:pPr>
+      <w:r>
+        <w:rPr>
+          <w:sz w:val="20"/>
+        </w:rPr>
+        <w:t>El sistema filtra automáticamente los presupuestos del paciente seleccionado.</w:t>
+      </w:r>
+    </w:p>
+    <w:p>
+      <w:pPr>
+        <w:pStyle w:val="ListNumber"/>
+        <w:spacing w:before="80" w:after="40"/>
+      </w:pPr>
+      <w:r>
+        <w:rPr>
+          <w:b/>
+          <w:sz w:val="21"/>
+        </w:rPr>
+        <w:t>O crear un presupuesto nuevo</w:t>
+      </w:r>
+    </w:p>
+    <w:p>
+      <w:pPr>
+        <w:pStyle w:val="ListBullet2"/>
+        <w:spacing w:before="20" w:after="20"/>
+      </w:pPr>
+      <w:r>
+        <w:rPr>
+          <w:sz w:val="20"/>
+        </w:rPr>
+        <w:t>Haz clic en '+ Nuevo presupuesto' para abrir el diálogo rápido de creación.</w:t>
+      </w:r>
+    </w:p>
+    <w:p>
+      <w:pPr>
+        <w:pStyle w:val="ListBullet2"/>
+        <w:spacing w:before="20" w:after="20"/>
+      </w:pPr>
+      <w:r>
+        <w:rPr>
+          <w:sz w:val="20"/>
+        </w:rPr>
+        <w:t>Agrega los ítems, moneda y notas. Al confirmar, queda vinculado automáticamente.</w:t>
+      </w:r>
+    </w:p>
+    <w:p>
+      <w:pPr>
+        <w:pStyle w:val="ListNumber"/>
+        <w:spacing w:before="80" w:after="40"/>
+      </w:pPr>
+      <w:r>
+        <w:rPr>
+          <w:b/>
+          <w:sz w:val="21"/>
+        </w:rPr>
+        <w:t>Guardar la cita</w:t>
+      </w:r>
+    </w:p>
+    <w:p>
+      <w:pPr>
+        <w:pStyle w:val="ListBullet2"/>
+        <w:spacing w:before="20" w:after="20"/>
+      </w:pPr>
+      <w:r>
+        <w:rPr>
+          <w:sz w:val="20"/>
+        </w:rPr>
+        <w:t>Haz clic en Guardar. El presupuesto vinculado quedará visible en el detalle de la cita.</w:t>
+      </w:r>
+    </w:p>
+    <w:tbl>
+      <w:tblPr>
+        <w:tblStyle w:val="TableGrid"/>
+        <w:tblW w:type="auto" w:w="0"/>
+        <w:tblLook w:firstColumn="1" w:firstRow="1" w:lastColumn="0" w:lastRow="0" w:noHBand="0" w:noVBand="1" w:val="04A0"/>
+        <w:tblBorders>
+          <w:top w:val="none"/>
+          <w:left w:val="none"/>
+          <w:bottom w:val="none"/>
+          <w:right w:val="none"/>
+          <w:insideH w:val="none"/>
+          <w:insideV w:val="none"/>
+        </w:tblBorders>
+      </w:tblPr>
+      <w:tblGrid>
+        <w:gridCol w:w="9406"/>
+      </w:tblGrid>
+      <w:tr>
+        <w:tc>
+          <w:tcPr>
+            <w:tcW w:type="dxa" w:w="9406"/>
+            <w:shd w:val="clear" w:color="auto" w:fill="EFF6FF"/>
+          </w:tcPr>
+          <w:p>
+            <w:pPr>
+              <w:spacing w:before="80" w:after="80"/>
+              <w:ind w:left="170"/>
+            </w:pPr>
+            <w:r>
+              <w:rPr>
+                <w:b/>
+                <w:color w:val="1E40AF"/>
+                <w:sz w:val="19"/>
+              </w:rPr>
+              <w:t xml:space="preserve">💡 Consejo: </w:t>
+            </w:r>
+            <w:r>
+              <w:rPr>
+                <w:color w:val="1E40AF"/>
+                <w:sz w:val="19"/>
+              </w:rPr>
+              <w:t>Vincular la cita al presupuesto permite rastrear qué atenciones corresponden a cada propuesta comercial y facilita la facturación posterior.</w:t>
+            </w:r>
+          </w:p>
+        </w:tc>
+      </w:tr>
+    </w:tbl>
+    <w:p/>
+    <w:p>
+      <w:pPr>
+        <w:pStyle w:val="Heading2"/>
+        <w:spacing w:before="280" w:after="120"/>
+      </w:pPr>
+      <w:r>
+        <w:rPr>
+          <w:color w:val="1E40AF"/>
+        </w:rPr>
+        <w:t>3.4  Completar una Cita con Sesión Clínica</w:t>
+      </w:r>
+    </w:p>
+    <w:p>
+      <w:r>
+        <w:t>Cuando se realiza la atención al paciente, la cita puede vincularse a una Sesión Clínica que documenta lo ejecutado. Esto cierra el ciclo: de la cita agendada a la intervención registrada.</w:t>
+      </w:r>
+    </w:p>
+    <w:p>
+      <w:pPr>
+        <w:pStyle w:val="ListNumber"/>
+        <w:spacing w:before="80" w:after="40"/>
+      </w:pPr>
+      <w:r>
+        <w:rPr>
+          <w:b/>
+          <w:sz w:val="21"/>
+        </w:rPr>
+        <w:t>Desde el Calendario</w:t>
+      </w:r>
+    </w:p>
+    <w:p>
+      <w:pPr>
+        <w:pStyle w:val="ListBullet2"/>
+        <w:spacing w:before="20" w:after="20"/>
+      </w:pPr>
+      <w:r>
+        <w:rPr>
+          <w:sz w:val="20"/>
+        </w:rPr>
+        <w:t>Localiza la cita ejecutada y ábrela.</w:t>
+      </w:r>
+    </w:p>
+    <w:p>
+      <w:pPr>
+        <w:pStyle w:val="ListBullet2"/>
+        <w:spacing w:before="20" w:after="20"/>
+      </w:pPr>
+      <w:r>
+        <w:rPr>
+          <w:sz w:val="20"/>
+        </w:rPr>
+        <w:t>Haz clic en 'Registrar sesión' dentro del formulario de cita.</w:t>
+      </w:r>
+    </w:p>
+    <w:p>
+      <w:pPr>
+        <w:pStyle w:val="ListBullet2"/>
+        <w:spacing w:before="20" w:after="20"/>
+      </w:pPr>
+      <w:r>
+        <w:rPr>
+          <w:sz w:val="20"/>
+        </w:rPr>
+        <w:t>Ingresa los procedimientos, observaciones y adjuntos relevantes.</w:t>
+      </w:r>
+    </w:p>
+    <w:p>
+      <w:pPr>
+        <w:pStyle w:val="ListBullet2"/>
+        <w:spacing w:before="20" w:after="20"/>
+      </w:pPr>
+      <w:r>
+        <w:rPr>
+          <w:sz w:val="20"/>
+        </w:rPr>
+        <w:t>Al confirmar, la sesión queda vinculada y la cita pasa a estado Completada.</w:t>
+      </w:r>
+    </w:p>
+    <w:p>
+      <w:pPr>
+        <w:pStyle w:val="ListNumber"/>
+        <w:spacing w:before="80" w:after="40"/>
+      </w:pPr>
+      <w:r>
+        <w:rPr>
+          <w:b/>
+          <w:sz w:val="21"/>
+        </w:rPr>
+        <w:t>Desde el botón COMPLETAR (en servicios de una Orden)</w:t>
+      </w:r>
+    </w:p>
+    <w:p>
+      <w:pPr>
+        <w:pStyle w:val="ListBullet2"/>
+        <w:spacing w:before="20" w:after="20"/>
+      </w:pPr>
+      <w:r>
+        <w:rPr>
+          <w:sz w:val="20"/>
+        </w:rPr>
+        <w:t>Ve a la Orden de Venta y localiza el ítem de servicio atendido.</w:t>
+      </w:r>
+    </w:p>
+    <w:p>
+      <w:pPr>
+        <w:pStyle w:val="ListBullet2"/>
+        <w:spacing w:before="20" w:after="20"/>
+      </w:pPr>
+      <w:r>
+        <w:rPr>
+          <w:sz w:val="20"/>
+        </w:rPr>
+        <w:t>Haz clic en el botón COMPLETAR del ítem.</w:t>
+      </w:r>
+    </w:p>
+    <w:p>
+      <w:pPr>
+        <w:pStyle w:val="ListBullet2"/>
+        <w:spacing w:before="20" w:after="20"/>
+      </w:pPr>
+      <w:r>
+        <w:rPr>
+          <w:sz w:val="20"/>
+        </w:rPr>
+        <w:t>Se abre el diálogo de sesión clínica. Completa los datos de la atención.</w:t>
+      </w:r>
+    </w:p>
+    <w:p>
+      <w:pPr>
+        <w:pStyle w:val="ListBullet2"/>
+        <w:spacing w:before="20" w:after="20"/>
+      </w:pPr>
+      <w:r>
+        <w:rPr>
+          <w:sz w:val="20"/>
+        </w:rPr>
+        <w:t>Al confirmar: la sesión se registra en la historia del paciente y el ítem queda marcado como Completado.</w:t>
+      </w:r>
+    </w:p>
+    <w:tbl>
+      <w:tblPr>
+        <w:tblStyle w:val="TableGrid"/>
+        <w:tblW w:type="auto" w:w="0"/>
+        <w:tblLook w:firstColumn="1" w:firstRow="1" w:lastColumn="0" w:lastRow="0" w:noHBand="0" w:noVBand="1" w:val="04A0"/>
+        <w:tblBorders>
+          <w:top w:val="none"/>
+          <w:left w:val="none"/>
+          <w:bottom w:val="none"/>
+          <w:right w:val="none"/>
+          <w:insideH w:val="none"/>
+          <w:insideV w:val="none"/>
+        </w:tblBorders>
+      </w:tblPr>
+      <w:tblGrid>
+        <w:gridCol w:w="9406"/>
+      </w:tblGrid>
+      <w:tr>
+        <w:tc>
+          <w:tcPr>
+            <w:tcW w:type="dxa" w:w="9406"/>
+            <w:shd w:val="clear" w:color="auto" w:fill="FFF7ED"/>
+          </w:tcPr>
+          <w:p>
+            <w:pPr>
+              <w:spacing w:before="80" w:after="80"/>
+              <w:ind w:left="170"/>
+            </w:pPr>
+            <w:r>
+              <w:rPr>
+                <w:b/>
+                <w:color w:val="92400E"/>
+                <w:sz w:val="19"/>
+              </w:rPr>
+              <w:t xml:space="preserve">⚠️  Nota: </w:t>
+            </w:r>
+            <w:r>
+              <w:rPr>
+                <w:color w:val="92400E"/>
+                <w:sz w:val="19"/>
+              </w:rPr>
+              <w:t>Solo los ítems en estado Completado son elegibles para incluirse en una factura. Completa el ítem antes de facturar.</w:t>
             </w:r>
           </w:p>
         </w:tc>
@@ -4744,6 +5157,689 @@
                 <w:sz w:val="19"/>
               </w:rPr>
               <w:t>El visor de estudios es compatible con el estándar DICOM y permite visualizar series de imágenes.</w:t>
+            </w:r>
+          </w:p>
+        </w:tc>
+      </w:tr>
+    </w:tbl>
+    <w:p/>
+    <w:p>
+      <w:r>
+        <w:br w:type="page"/>
+      </w:r>
+    </w:p>
+    <w:p>
+      <w:pPr>
+        <w:pStyle w:val="Heading1"/>
+      </w:pPr>
+      <w:r>
+        <w:rPr>
+          <w:color w:val="1E40AF"/>
+        </w:rPr>
+        <w:t>Módulo 9 — Pantalla de Sala de Espera (TV Display)</w:t>
+      </w:r>
+    </w:p>
+    <w:p>
+      <w:r>
+        <w:rPr>
+          <w:i/>
+          <w:color w:val="6B7280"/>
+          <w:sz w:val="20"/>
+        </w:rPr>
+        <w:t>Proyecta los turnos del día en un monitor de sala de espera en tiempo real.</w:t>
+      </w:r>
+    </w:p>
+    <w:p/>
+    <w:p>
+      <w:r>
+        <w:t>La funcionalidad TV Display permite mostrar en una TV o monitor secundario los turnos del día agrupados por consultorio. Se controla desde el sistema sin necesidad de tocar la pantalla de TV.</w:t>
+      </w:r>
+    </w:p>
+    <w:p>
+      <w:pPr>
+        <w:pStyle w:val="Heading2"/>
+        <w:spacing w:before="280" w:after="120"/>
+      </w:pPr>
+      <w:r>
+        <w:rPr>
+          <w:color w:val="1E40AF"/>
+        </w:rPr>
+        <w:t>9.1  Configuración</w:t>
+      </w:r>
+    </w:p>
+    <w:p>
+      <w:pPr>
+        <w:pStyle w:val="ListNumber"/>
+        <w:spacing w:before="80" w:after="40"/>
+      </w:pPr>
+      <w:r>
+        <w:rPr>
+          <w:b/>
+          <w:sz w:val="21"/>
+        </w:rPr>
+        <w:t>Ir a Pantalla TV</w:t>
+      </w:r>
+    </w:p>
+    <w:p>
+      <w:pPr>
+        <w:pStyle w:val="ListBullet2"/>
+        <w:spacing w:before="20" w:after="20"/>
+      </w:pPr>
+      <w:r>
+        <w:rPr>
+          <w:sz w:val="20"/>
+        </w:rPr>
+        <w:t>En el menú lateral, haz clic en Pantalla TV (ícono de monitor).</w:t>
+      </w:r>
+    </w:p>
+    <w:p>
+      <w:pPr>
+        <w:pStyle w:val="ListNumber"/>
+        <w:spacing w:before="80" w:after="40"/>
+      </w:pPr>
+      <w:r>
+        <w:rPr>
+          <w:b/>
+          <w:sz w:val="21"/>
+        </w:rPr>
+        <w:t>Seleccionar consultorios</w:t>
+      </w:r>
+    </w:p>
+    <w:p>
+      <w:pPr>
+        <w:pStyle w:val="ListBullet2"/>
+        <w:spacing w:before="20" w:after="20"/>
+      </w:pPr>
+      <w:r>
+        <w:rPr>
+          <w:sz w:val="20"/>
+        </w:rPr>
+        <w:t>En el campo Consultorios, selecciona los calendarios que quieres mostrar en pantalla.</w:t>
+      </w:r>
+    </w:p>
+    <w:p>
+      <w:pPr>
+        <w:pStyle w:val="ListBullet2"/>
+        <w:spacing w:before="20" w:after="20"/>
+      </w:pPr>
+      <w:r>
+        <w:rPr>
+          <w:sz w:val="20"/>
+        </w:rPr>
+        <w:t>Cada calendario aparecerá como una columna independiente en la TV.</w:t>
+      </w:r>
+    </w:p>
+    <w:p>
+      <w:pPr>
+        <w:pStyle w:val="ListNumber"/>
+        <w:spacing w:before="80" w:after="40"/>
+      </w:pPr>
+      <w:r>
+        <w:rPr>
+          <w:b/>
+          <w:sz w:val="21"/>
+        </w:rPr>
+        <w:t>Configurar apariencia</w:t>
+      </w:r>
+    </w:p>
+    <w:p>
+      <w:pPr>
+        <w:pStyle w:val="ListBullet2"/>
+        <w:spacing w:before="20" w:after="20"/>
+      </w:pPr>
+      <w:r>
+        <w:rPr>
+          <w:sz w:val="20"/>
+        </w:rPr>
+        <w:t>Tema: elige entre Oscuro, Claro o Branded.</w:t>
+      </w:r>
+    </w:p>
+    <w:p>
+      <w:pPr>
+        <w:pStyle w:val="ListBullet2"/>
+        <w:spacing w:before="20" w:after="20"/>
+      </w:pPr>
+      <w:r>
+        <w:rPr>
+          <w:sz w:val="20"/>
+        </w:rPr>
+        <w:t>Activa o desactiva el reloj y la fecha en el encabezado.</w:t>
+      </w:r>
+    </w:p>
+    <w:p>
+      <w:pPr>
+        <w:pStyle w:val="ListBullet2"/>
+        <w:spacing w:before="20" w:after="20"/>
+      </w:pPr>
+      <w:r>
+        <w:rPr>
+          <w:sz w:val="20"/>
+        </w:rPr>
+        <w:t>Elige qué datos del paciente mostrar: nombre, doctor, hora del turno, próximo paciente.</w:t>
+      </w:r>
+    </w:p>
+    <w:p>
+      <w:pPr>
+        <w:pStyle w:val="ListNumber"/>
+        <w:spacing w:before="80" w:after="40"/>
+      </w:pPr>
+      <w:r>
+        <w:rPr>
+          <w:b/>
+          <w:sz w:val="21"/>
+        </w:rPr>
+        <w:t>Información de la clínica</w:t>
+      </w:r>
+    </w:p>
+    <w:p>
+      <w:pPr>
+        <w:pStyle w:val="ListBullet2"/>
+        <w:spacing w:before="20" w:after="20"/>
+      </w:pPr>
+      <w:r>
+        <w:rPr>
+          <w:sz w:val="20"/>
+        </w:rPr>
+        <w:t>El nombre y logo se toman automáticamente de la configuración del sistema.</w:t>
+      </w:r>
+    </w:p>
+    <w:p>
+      <w:pPr>
+        <w:pStyle w:val="ListBullet2"/>
+        <w:spacing w:before="20" w:after="20"/>
+      </w:pPr>
+      <w:r>
+        <w:rPr>
+          <w:sz w:val="20"/>
+        </w:rPr>
+        <w:t>Activa o desactiva la visibilidad del teléfono, dirección y email de la clínica en el encabezado.</w:t>
+      </w:r>
+    </w:p>
+    <w:p>
+      <w:pPr>
+        <w:pStyle w:val="ListNumber"/>
+        <w:spacing w:before="80" w:after="40"/>
+      </w:pPr>
+      <w:r>
+        <w:rPr>
+          <w:b/>
+          <w:sz w:val="21"/>
+        </w:rPr>
+        <w:t>Videos</w:t>
+      </w:r>
+    </w:p>
+    <w:p>
+      <w:pPr>
+        <w:pStyle w:val="ListBullet2"/>
+        <w:spacing w:before="20" w:after="20"/>
+      </w:pPr>
+      <w:r>
+        <w:rPr>
+          <w:sz w:val="20"/>
+        </w:rPr>
+        <w:t>Videos de Promoción: URLs de videos o YouTube que se reproducen en pantalla completa entre cambios de paciente. Se reproducen en bucle.</w:t>
+      </w:r>
+    </w:p>
+    <w:p>
+      <w:pPr>
+        <w:pStyle w:val="ListBullet2"/>
+        <w:spacing w:before="20" w:after="20"/>
+      </w:pPr>
+      <w:r>
+        <w:rPr>
+          <w:sz w:val="20"/>
+        </w:rPr>
+        <w:t>Columna de Videos Lateral: videos permanentes en una columna a la izquierda, derecha, arriba o abajo de la grilla. Elige 'Ninguna' para desactivar.</w:t>
+      </w:r>
+    </w:p>
+    <w:p>
+      <w:pPr>
+        <w:pStyle w:val="ListNumber"/>
+        <w:spacing w:before="80" w:after="40"/>
+      </w:pPr>
+      <w:r>
+        <w:rPr>
+          <w:b/>
+          <w:sz w:val="21"/>
+        </w:rPr>
+        <w:t>Intervalo de actualización</w:t>
+      </w:r>
+    </w:p>
+    <w:p>
+      <w:pPr>
+        <w:pStyle w:val="ListBullet2"/>
+        <w:spacing w:before="20" w:after="20"/>
+      </w:pPr>
+      <w:r>
+        <w:rPr>
+          <w:sz w:val="20"/>
+        </w:rPr>
+        <w:t>Define cada cuántos minutos el sistema recarga los turnos del día automáticamente.</w:t>
+      </w:r>
+    </w:p>
+    <w:tbl>
+      <w:tblPr>
+        <w:tblStyle w:val="TableGrid"/>
+        <w:tblW w:type="auto" w:w="0"/>
+        <w:tblLook w:firstColumn="1" w:firstRow="1" w:lastColumn="0" w:lastRow="0" w:noHBand="0" w:noVBand="1" w:val="04A0"/>
+        <w:tblBorders>
+          <w:top w:val="none"/>
+          <w:left w:val="none"/>
+          <w:bottom w:val="none"/>
+          <w:right w:val="none"/>
+          <w:insideH w:val="none"/>
+          <w:insideV w:val="none"/>
+        </w:tblBorders>
+      </w:tblPr>
+      <w:tblGrid>
+        <w:gridCol w:w="9406"/>
+      </w:tblGrid>
+      <w:tr>
+        <w:tc>
+          <w:tcPr>
+            <w:tcW w:type="dxa" w:w="9406"/>
+            <w:shd w:val="clear" w:color="auto" w:fill="EFF6FF"/>
+          </w:tcPr>
+          <w:p>
+            <w:pPr>
+              <w:spacing w:before="80" w:after="80"/>
+              <w:ind w:left="170"/>
+            </w:pPr>
+            <w:r>
+              <w:rPr>
+                <w:b/>
+                <w:color w:val="1E40AF"/>
+                <w:sz w:val="19"/>
+              </w:rPr>
+              <w:t xml:space="preserve">💡 Consejo: </w:t>
+            </w:r>
+            <w:r>
+              <w:rPr>
+                <w:color w:val="1E40AF"/>
+                <w:sz w:val="19"/>
+              </w:rPr>
+              <w:t>El preview en la página de configuración refleja en tiempo real todos los cambios de configuración antes de encender la pantalla.</w:t>
+            </w:r>
+          </w:p>
+        </w:tc>
+      </w:tr>
+    </w:tbl>
+    <w:p/>
+    <w:p>
+      <w:pPr>
+        <w:pStyle w:val="Heading2"/>
+        <w:spacing w:before="280" w:after="120"/>
+      </w:pPr>
+      <w:r>
+        <w:rPr>
+          <w:color w:val="1E40AF"/>
+        </w:rPr>
+        <w:t>9.2  Encender la Pantalla</w:t>
+      </w:r>
+    </w:p>
+    <w:p>
+      <w:pPr>
+        <w:pStyle w:val="ListNumber"/>
+        <w:spacing w:before="80" w:after="40"/>
+      </w:pPr>
+      <w:r>
+        <w:rPr>
+          <w:b/>
+          <w:sz w:val="21"/>
+        </w:rPr>
+        <w:t>Hacer clic en 'Encender pantalla'</w:t>
+      </w:r>
+    </w:p>
+    <w:p>
+      <w:pPr>
+        <w:pStyle w:val="ListBullet2"/>
+        <w:spacing w:before="20" w:after="20"/>
+      </w:pPr>
+      <w:r>
+        <w:rPr>
+          <w:sz w:val="20"/>
+        </w:rPr>
+        <w:t>Se abrirá una nueva ventana del navegador con la pantalla TV en modo fullscreen.</w:t>
+      </w:r>
+    </w:p>
+    <w:p>
+      <w:pPr>
+        <w:pStyle w:val="ListBullet2"/>
+        <w:spacing w:before="20" w:after="20"/>
+      </w:pPr>
+      <w:r>
+        <w:rPr>
+          <w:sz w:val="20"/>
+        </w:rPr>
+        <w:t>Arrastra esa ventana al monitor secundario o TV conectada a la computadora.</w:t>
+      </w:r>
+    </w:p>
+    <w:p>
+      <w:pPr>
+        <w:pStyle w:val="ListNumber"/>
+        <w:spacing w:before="80" w:after="40"/>
+      </w:pPr>
+      <w:r>
+        <w:rPr>
+          <w:b/>
+          <w:sz w:val="21"/>
+        </w:rPr>
+        <w:t>Sincronización automática</w:t>
+      </w:r>
+    </w:p>
+    <w:p>
+      <w:pPr>
+        <w:pStyle w:val="ListBullet2"/>
+        <w:spacing w:before="20" w:after="20"/>
+      </w:pPr>
+      <w:r>
+        <w:rPr>
+          <w:sz w:val="20"/>
+        </w:rPr>
+        <w:t>La pantalla TV se sincroniza automáticamente con el sistema vía BroadcastChannel.</w:t>
+      </w:r>
+    </w:p>
+    <w:p>
+      <w:pPr>
+        <w:pStyle w:val="ListBullet2"/>
+        <w:spacing w:before="20" w:after="20"/>
+      </w:pPr>
+      <w:r>
+        <w:rPr>
+          <w:sz w:val="20"/>
+        </w:rPr>
+        <w:t>No es necesario recargarla manualmente cuando se realizan cambios.</w:t>
+      </w:r>
+    </w:p>
+    <w:tbl>
+      <w:tblPr>
+        <w:tblStyle w:val="TableGrid"/>
+        <w:tblW w:type="auto" w:w="0"/>
+        <w:tblLook w:firstColumn="1" w:firstRow="1" w:lastColumn="0" w:lastRow="0" w:noHBand="0" w:noVBand="1" w:val="04A0"/>
+        <w:tblBorders>
+          <w:top w:val="none"/>
+          <w:left w:val="none"/>
+          <w:bottom w:val="none"/>
+          <w:right w:val="none"/>
+          <w:insideH w:val="none"/>
+          <w:insideV w:val="none"/>
+        </w:tblBorders>
+      </w:tblPr>
+      <w:tblGrid>
+        <w:gridCol w:w="9406"/>
+      </w:tblGrid>
+      <w:tr>
+        <w:tc>
+          <w:tcPr>
+            <w:tcW w:type="dxa" w:w="9406"/>
+            <w:shd w:val="clear" w:color="auto" w:fill="EFF6FF"/>
+          </w:tcPr>
+          <w:p>
+            <w:pPr>
+              <w:spacing w:before="80" w:after="80"/>
+              <w:ind w:left="170"/>
+            </w:pPr>
+            <w:r>
+              <w:rPr>
+                <w:b/>
+                <w:color w:val="1E40AF"/>
+                <w:sz w:val="19"/>
+              </w:rPr>
+              <w:t xml:space="preserve">💡 Consejo: </w:t>
+            </w:r>
+            <w:r>
+              <w:rPr>
+                <w:color w:val="1E40AF"/>
+                <w:sz w:val="19"/>
+              </w:rPr>
+              <w:t>Mantén la ventana TV abierta en el navegador del monitor de sala de espera durante toda la jornada.</w:t>
+            </w:r>
+          </w:p>
+        </w:tc>
+      </w:tr>
+    </w:tbl>
+    <w:p/>
+    <w:p>
+      <w:pPr>
+        <w:pStyle w:val="Heading2"/>
+        <w:spacing w:before="280" w:after="120"/>
+      </w:pPr>
+      <w:r>
+        <w:rPr>
+          <w:color w:val="1E40AF"/>
+        </w:rPr>
+        <w:t>9.3  Widget Flotante de Control Rápido</w:t>
+      </w:r>
+    </w:p>
+    <w:p>
+      <w:r>
+        <w:t>Una vez encendida, aparece un widget flotante en la barra del sistema (ícono de TV con indicador verde = encendida / rojo = apagada). Al hacer clic se despliega el menú de control:</w:t>
+      </w:r>
+    </w:p>
+    <w:p>
+      <w:pPr>
+        <w:pStyle w:val="ListBullet"/>
+      </w:pPr>
+      <w:r>
+        <w:rPr>
+          <w:b/>
+        </w:rPr>
+        <w:t xml:space="preserve">Siguiente paciente por consultorio: </w:t>
+      </w:r>
+      <w:r>
+        <w:t>Un botón por cada consultorio activo. Al presionarlo, la TV muestra una tarjeta de anuncio con el próximo paciente y avanza el turno.</w:t>
+      </w:r>
+    </w:p>
+    <w:p>
+      <w:pPr>
+        <w:pStyle w:val="ListBullet"/>
+      </w:pPr>
+      <w:r>
+        <w:rPr>
+          <w:b/>
+        </w:rPr>
+        <w:t xml:space="preserve">Pausar pantalla: </w:t>
+      </w:r>
+      <w:r>
+        <w:t>Congela la visualización con superposición 'PAUSADO'. Útil durante recesos.</w:t>
+      </w:r>
+    </w:p>
+    <w:p>
+      <w:pPr>
+        <w:pStyle w:val="ListBullet"/>
+      </w:pPr>
+      <w:r>
+        <w:rPr>
+          <w:b/>
+        </w:rPr>
+        <w:t xml:space="preserve">Mostrar promoción: </w:t>
+      </w:r>
+      <w:r>
+        <w:t>Activa el modo promo: los videos de promoción se reproducen en pantalla completa.</w:t>
+      </w:r>
+    </w:p>
+    <w:p>
+      <w:pPr>
+        <w:pStyle w:val="ListBullet"/>
+      </w:pPr>
+      <w:r>
+        <w:rPr>
+          <w:b/>
+        </w:rPr>
+        <w:t xml:space="preserve">Actualizar datos: </w:t>
+      </w:r>
+      <w:r>
+        <w:t>Fuerza una recarga inmediata de los turnos desde el servidor.</w:t>
+      </w:r>
+    </w:p>
+    <w:p>
+      <w:pPr>
+        <w:pStyle w:val="ListBullet"/>
+      </w:pPr>
+      <w:r>
+        <w:rPr>
+          <w:b/>
+        </w:rPr>
+        <w:t xml:space="preserve">Apagar: </w:t>
+      </w:r>
+      <w:r>
+        <w:t>Apaga la pantalla TV (muestra superposición 'APAGADO').</w:t>
+      </w:r>
+    </w:p>
+    <w:p/>
+    <w:p>
+      <w:pPr>
+        <w:pStyle w:val="Heading2"/>
+        <w:spacing w:before="280" w:after="120"/>
+      </w:pPr>
+      <w:r>
+        <w:rPr>
+          <w:color w:val="1E40AF"/>
+        </w:rPr>
+        <w:t>9.4  Flujo Típico de Uso Diario</w:t>
+      </w:r>
+    </w:p>
+    <w:p>
+      <w:pPr>
+        <w:pStyle w:val="ListNumber"/>
+        <w:spacing w:before="80" w:after="40"/>
+      </w:pPr>
+      <w:r>
+        <w:rPr>
+          <w:b/>
+          <w:sz w:val="21"/>
+        </w:rPr>
+        <w:t>Inicio del día</w:t>
+      </w:r>
+    </w:p>
+    <w:p>
+      <w:pPr>
+        <w:pStyle w:val="ListBullet2"/>
+        <w:spacing w:before="20" w:after="20"/>
+      </w:pPr>
+      <w:r>
+        <w:rPr>
+          <w:sz w:val="20"/>
+        </w:rPr>
+        <w:t>Ir a Pantalla TV → verificar que los consultorios correctos están seleccionados.</w:t>
+      </w:r>
+    </w:p>
+    <w:p>
+      <w:pPr>
+        <w:pStyle w:val="ListBullet2"/>
+        <w:spacing w:before="20" w:after="20"/>
+      </w:pPr>
+      <w:r>
+        <w:rPr>
+          <w:sz w:val="20"/>
+        </w:rPr>
+        <w:t>Hacer clic en Encender pantalla y mover la ventana al monitor de sala de espera.</w:t>
+      </w:r>
+    </w:p>
+    <w:p>
+      <w:pPr>
+        <w:pStyle w:val="ListNumber"/>
+        <w:spacing w:before="80" w:after="40"/>
+      </w:pPr>
+      <w:r>
+        <w:rPr>
+          <w:b/>
+          <w:sz w:val="21"/>
+        </w:rPr>
+        <w:t>Durante la jornada</w:t>
+      </w:r>
+    </w:p>
+    <w:p>
+      <w:pPr>
+        <w:pStyle w:val="ListBullet2"/>
+        <w:spacing w:before="20" w:after="20"/>
+      </w:pPr>
+      <w:r>
+        <w:rPr>
+          <w:sz w:val="20"/>
+        </w:rPr>
+        <w:t>Cuando un paciente pasa a consultorio: abrir el widget flotante → hacer clic en 'Siguiente: [Consultorio X]'.</w:t>
+      </w:r>
+    </w:p>
+    <w:p>
+      <w:pPr>
+        <w:pStyle w:val="ListBullet2"/>
+        <w:spacing w:before="20" w:after="20"/>
+      </w:pPr>
+      <w:r>
+        <w:rPr>
+          <w:sz w:val="20"/>
+        </w:rPr>
+        <w:t>La TV muestra el anuncio con el nombre del paciente entrante y avanza al siguiente turno.</w:t>
+      </w:r>
+    </w:p>
+    <w:p>
+      <w:pPr>
+        <w:pStyle w:val="ListNumber"/>
+        <w:spacing w:before="80" w:after="40"/>
+      </w:pPr>
+      <w:r>
+        <w:rPr>
+          <w:b/>
+          <w:sz w:val="21"/>
+        </w:rPr>
+        <w:t>Fin del día o recesos</w:t>
+      </w:r>
+    </w:p>
+    <w:p>
+      <w:pPr>
+        <w:pStyle w:val="ListBullet2"/>
+        <w:spacing w:before="20" w:after="20"/>
+      </w:pPr>
+      <w:r>
+        <w:rPr>
+          <w:sz w:val="20"/>
+        </w:rPr>
+        <w:t>Pausar o apagar la pantalla desde el widget flotante.</w:t>
+      </w:r>
+    </w:p>
+    <w:tbl>
+      <w:tblPr>
+        <w:tblStyle w:val="TableGrid"/>
+        <w:tblW w:type="auto" w:w="0"/>
+        <w:tblLook w:firstColumn="1" w:firstRow="1" w:lastColumn="0" w:lastRow="0" w:noHBand="0" w:noVBand="1" w:val="04A0"/>
+        <w:tblBorders>
+          <w:top w:val="none"/>
+          <w:left w:val="none"/>
+          <w:bottom w:val="none"/>
+          <w:right w:val="none"/>
+          <w:insideH w:val="none"/>
+          <w:insideV w:val="none"/>
+        </w:tblBorders>
+      </w:tblPr>
+      <w:tblGrid>
+        <w:gridCol w:w="9406"/>
+      </w:tblGrid>
+      <w:tr>
+        <w:tc>
+          <w:tcPr>
+            <w:tcW w:type="dxa" w:w="9406"/>
+            <w:shd w:val="clear" w:color="auto" w:fill="EFF6FF"/>
+          </w:tcPr>
+          <w:p>
+            <w:pPr>
+              <w:spacing w:before="80" w:after="80"/>
+              <w:ind w:left="170"/>
+            </w:pPr>
+            <w:r>
+              <w:rPr>
+                <w:b/>
+                <w:color w:val="1E40AF"/>
+                <w:sz w:val="19"/>
+              </w:rPr>
+              <w:t xml:space="preserve">💡 Consejo: </w:t>
+            </w:r>
+            <w:r>
+              <w:rPr>
+                <w:color w:val="1E40AF"/>
+                <w:sz w:val="19"/>
+              </w:rPr>
+              <w:t>Si hay videos de promoción configurados, puedes activar el modo Promo durante esperas largas o entre pacientes.</w:t>
             </w:r>
           </w:p>
         </w:tc>

</xml_diff>